<commit_message>
se agrega fecha de publicacion
</commit_message>
<xml_diff>
--- a/doc/Requerimientos Funcionales y no funcionales.docx
+++ b/doc/Requerimientos Funcionales y no funcionales.docx
@@ -7,12 +7,16 @@
         <w:rPr>
           <w:b/>
           <w:bCs/>
-        </w:rPr>
-      </w:pPr>
-      <w:r>
-        <w:rPr>
-          <w:b/>
-          <w:bCs/>
+          <w:sz w:val="26"/>
+          <w:szCs w:val="26"/>
+        </w:rPr>
+      </w:pPr>
+      <w:r>
+        <w:rPr>
+          <w:b/>
+          <w:bCs/>
+          <w:sz w:val="26"/>
+          <w:szCs w:val="26"/>
         </w:rPr>
         <w:t xml:space="preserve">1 </w:t>
       </w:r>
@@ -21,6 +25,8 @@
         <w:rPr>
           <w:b/>
           <w:bCs/>
+          <w:sz w:val="26"/>
+          <w:szCs w:val="26"/>
         </w:rPr>
         <w:t>Requerimientos</w:t>
       </w:r>
@@ -29,8 +35,19 @@
         <w:rPr>
           <w:b/>
           <w:bCs/>
+          <w:sz w:val="26"/>
+          <w:szCs w:val="26"/>
         </w:rPr>
         <w:t xml:space="preserve"> Funcionales</w:t>
+      </w:r>
+      <w:r>
+        <w:rPr>
+          <w:b/>
+          <w:bCs/>
+          <w:sz w:val="26"/>
+          <w:szCs w:val="26"/>
+        </w:rPr>
+        <w:t xml:space="preserve"> y No Funcionales</w:t>
       </w:r>
     </w:p>
     <w:p>
@@ -94,6 +111,9 @@
         <w:t>insert</w:t>
       </w:r>
       <w:proofErr w:type="spellEnd"/>
+      <w:r>
+        <w:t>.</w:t>
+      </w:r>
     </w:p>
     <w:p>
       <w:pPr>
@@ -243,14 +263,7 @@
         </w:numPr>
       </w:pPr>
       <w:r>
-        <w:rPr>
-          <w:b/>
-          <w:bCs/>
-        </w:rPr>
-        <w:t>1 (Algoritmo):</w:t>
-      </w:r>
-      <w:r>
-        <w:t xml:space="preserve"> Al crear un libro, el </w:t>
+        <w:t xml:space="preserve">Al crear un libro, el </w:t>
       </w:r>
       <w:proofErr w:type="spellStart"/>
       <w:r>
@@ -374,92 +387,41 @@
           <w:bCs/>
         </w:rPr>
       </w:pPr>
-    </w:p>
-    <w:p>
-      <w:pPr>
-        <w:rPr>
-          <w:b/>
-          <w:bCs/>
-        </w:rPr>
-      </w:pPr>
-    </w:p>
-    <w:p>
-      <w:pPr>
-        <w:rPr>
-          <w:b/>
-          <w:bCs/>
-        </w:rPr>
-      </w:pPr>
-    </w:p>
-    <w:p>
-      <w:pPr>
-        <w:rPr>
-          <w:b/>
-          <w:bCs/>
-        </w:rPr>
-      </w:pPr>
-    </w:p>
-    <w:p>
-      <w:pPr>
-        <w:rPr>
-          <w:b/>
-          <w:bCs/>
-        </w:rPr>
-      </w:pPr>
-    </w:p>
-    <w:p>
-      <w:pPr>
-        <w:rPr>
-          <w:b/>
-          <w:bCs/>
-        </w:rPr>
-      </w:pPr>
-    </w:p>
-    <w:p>
-      <w:pPr>
-        <w:rPr>
-          <w:b/>
-          <w:bCs/>
-        </w:rPr>
-      </w:pPr>
-    </w:p>
-    <w:p>
-      <w:pPr>
-        <w:rPr>
-          <w:b/>
-          <w:bCs/>
-        </w:rPr>
-      </w:pPr>
-    </w:p>
-    <w:p>
-      <w:pPr>
-        <w:rPr>
-          <w:b/>
-          <w:bCs/>
-        </w:rPr>
-      </w:pPr>
-      <w:r>
-        <w:rPr>
-          <w:b/>
-          <w:bCs/>
-        </w:rPr>
-        <w:lastRenderedPageBreak/>
-        <w:t>2. Requerimientos No Funcionales</w:t>
-      </w:r>
-    </w:p>
-    <w:p>
-      <w:pPr>
-        <w:rPr>
-          <w:b/>
-          <w:bCs/>
-        </w:rPr>
-      </w:pPr>
-      <w:r>
-        <w:rPr>
-          <w:b/>
-          <w:bCs/>
-        </w:rPr>
-        <w:t>2.1</w:t>
+      <w:r>
+        <w:rPr>
+          <w:b/>
+          <w:bCs/>
+        </w:rPr>
+        <w:t>No Funcionales</w:t>
+      </w:r>
+    </w:p>
+    <w:p>
+      <w:pPr>
+        <w:rPr>
+          <w:b/>
+          <w:bCs/>
+        </w:rPr>
+      </w:pPr>
+      <w:r>
+        <w:rPr>
+          <w:b/>
+          <w:bCs/>
+        </w:rPr>
+        <w:t>1</w:t>
+      </w:r>
+      <w:r>
+        <w:rPr>
+          <w:b/>
+          <w:bCs/>
+        </w:rPr>
+        <w:t>.</w:t>
+      </w:r>
+      <w:r>
+        <w:rPr>
+          <w:b/>
+          <w:bCs/>
+        </w:rPr>
+        <w:t>3</w:t>
       </w:r>
       <w:r>
         <w:rPr>
@@ -481,7 +443,21 @@
           <w:b/>
           <w:bCs/>
         </w:rPr>
-        <w:t>Motor:</w:t>
+        <w:t>Motor</w:t>
+      </w:r>
+      <w:r>
+        <w:rPr>
+          <w:b/>
+          <w:bCs/>
+        </w:rPr>
+        <w:t xml:space="preserve"> BDD</w:t>
+      </w:r>
+      <w:r>
+        <w:rPr>
+          <w:b/>
+          <w:bCs/>
+        </w:rPr>
+        <w:t>:</w:t>
       </w:r>
       <w:r>
         <w:t xml:space="preserve"> MySQL</w:t>
@@ -546,7 +522,21 @@
           <w:b/>
           <w:bCs/>
         </w:rPr>
-        <w:t>2.2</w:t>
+        <w:t>1</w:t>
+      </w:r>
+      <w:r>
+        <w:rPr>
+          <w:b/>
+          <w:bCs/>
+        </w:rPr>
+        <w:t>.</w:t>
+      </w:r>
+      <w:r>
+        <w:rPr>
+          <w:b/>
+          <w:bCs/>
+        </w:rPr>
+        <w:t>4</w:t>
       </w:r>
       <w:r>
         <w:rPr>
@@ -601,6 +591,7 @@
           <w:b/>
           <w:bCs/>
         </w:rPr>
+        <w:lastRenderedPageBreak/>
         <w:t>Reglas de Negocio en</w:t>
       </w:r>
       <w:r>
@@ -625,25 +616,36 @@
           <w:numId w:val="5"/>
         </w:numPr>
       </w:pPr>
+      <w:r>
+        <w:t xml:space="preserve">ID: </w:t>
+      </w:r>
+      <w:r>
+        <w:t xml:space="preserve">entero de </w:t>
+      </w:r>
+      <w:r>
+        <w:t xml:space="preserve">incremento automático </w:t>
+      </w:r>
       <w:proofErr w:type="spellStart"/>
       <w:r>
-        <w:t>titulo</w:t>
+        <w:t>generaro</w:t>
       </w:r>
       <w:proofErr w:type="spellEnd"/>
       <w:r>
-        <w:t xml:space="preserve">: </w:t>
-      </w:r>
-      <w:proofErr w:type="gramStart"/>
-      <w:r>
-        <w:t>VARCHAR(</w:t>
-      </w:r>
-      <w:proofErr w:type="gramEnd"/>
-      <w:r>
-        <w:t>255</w:t>
-      </w:r>
-      <w:r>
-        <w:t>), no vacío.</w:t>
-      </w:r>
+        <w:t xml:space="preserve"> por </w:t>
+      </w:r>
+      <w:proofErr w:type="spellStart"/>
+      <w:r>
+        <w:t>por</w:t>
+      </w:r>
+      <w:proofErr w:type="spellEnd"/>
+      <w:r>
+        <w:t xml:space="preserve"> </w:t>
+      </w:r>
+      <w:proofErr w:type="spellStart"/>
+      <w:r>
+        <w:t>bdd</w:t>
+      </w:r>
+      <w:proofErr w:type="spellEnd"/>
     </w:p>
     <w:p>
       <w:pPr>
@@ -653,19 +655,35 @@
         </w:numPr>
       </w:pPr>
       <w:r>
-        <w:t xml:space="preserve">autor: </w:t>
-      </w:r>
+        <w:t>CODE</w:t>
+      </w:r>
+      <w:r>
+        <w:t>:</w:t>
+      </w:r>
+      <w:r>
+        <w:t xml:space="preserve"> </w:t>
+      </w:r>
+      <w:r>
+        <w:t xml:space="preserve">generación automática con algoritmo </w:t>
+      </w:r>
+      <w:r>
+        <w:t xml:space="preserve">o </w:t>
+      </w:r>
+      <w:proofErr w:type="spellStart"/>
       <w:proofErr w:type="gramStart"/>
       <w:r>
-        <w:t>VARCHAR(</w:t>
-      </w:r>
+        <w:t>función,no</w:t>
+      </w:r>
+      <w:proofErr w:type="spellEnd"/>
       <w:proofErr w:type="gramEnd"/>
       <w:r>
-        <w:t>255</w:t>
-      </w:r>
-      <w:r>
-        <w:t>), no vacío.</w:t>
-      </w:r>
+        <w:t xml:space="preserve"> </w:t>
+      </w:r>
+      <w:proofErr w:type="spellStart"/>
+      <w:r>
+        <w:t>vacio</w:t>
+      </w:r>
+      <w:proofErr w:type="spellEnd"/>
     </w:p>
     <w:p>
       <w:pPr>
@@ -674,11 +692,9 @@
           <w:numId w:val="5"/>
         </w:numPr>
       </w:pPr>
-      <w:proofErr w:type="spellStart"/>
-      <w:r>
-        <w:t>genero</w:t>
-      </w:r>
-      <w:proofErr w:type="spellEnd"/>
+      <w:r>
+        <w:t>TITULO DEL LIBRO</w:t>
+      </w:r>
       <w:r>
         <w:t xml:space="preserve">: </w:t>
       </w:r>
@@ -701,19 +717,22 @@
           <w:numId w:val="5"/>
         </w:numPr>
       </w:pPr>
-      <w:proofErr w:type="spellStart"/>
-      <w:r>
-        <w:t>Fecha_publicación</w:t>
-      </w:r>
-      <w:proofErr w:type="spellEnd"/>
-      <w:r>
-        <w:t>:</w:t>
-      </w:r>
-      <w:r>
-        <w:t xml:space="preserve"> </w:t>
-      </w:r>
-      <w:r>
-        <w:t>date</w:t>
+      <w:r>
+        <w:t>A</w:t>
+      </w:r>
+      <w:r>
+        <w:t xml:space="preserve">utor: </w:t>
+      </w:r>
+      <w:proofErr w:type="gramStart"/>
+      <w:r>
+        <w:t>VARCHAR(</w:t>
+      </w:r>
+      <w:proofErr w:type="gramEnd"/>
+      <w:r>
+        <w:t>255</w:t>
+      </w:r>
+      <w:r>
+        <w:t>), no vacío.</w:t>
       </w:r>
     </w:p>
     <w:p>
@@ -723,13 +742,24 @@
           <w:numId w:val="5"/>
         </w:numPr>
       </w:pPr>
+      <w:proofErr w:type="spellStart"/>
+      <w:r>
+        <w:t>Genero</w:t>
+      </w:r>
+      <w:proofErr w:type="spellEnd"/>
+      <w:r>
+        <w:t xml:space="preserve">: </w:t>
+      </w:r>
       <w:proofErr w:type="gramStart"/>
       <w:r>
-        <w:t>ID :</w:t>
+        <w:t>VARCHAR(</w:t>
       </w:r>
       <w:proofErr w:type="gramEnd"/>
       <w:r>
-        <w:t xml:space="preserve"> incremento automático como llave primaria</w:t>
+        <w:t>255</w:t>
+      </w:r>
+      <w:r>
+        <w:t>), no vacío.</w:t>
       </w:r>
     </w:p>
     <w:p>
@@ -740,22 +770,53 @@
         </w:numPr>
       </w:pPr>
       <w:r>
-        <w:t>CODE: generación automática con algoritmo</w:t>
-      </w:r>
-    </w:p>
-    <w:p>
-      <w:pPr>
-        <w:rPr>
-          <w:b/>
-          <w:bCs/>
-        </w:rPr>
-      </w:pPr>
-      <w:r>
-        <w:rPr>
-          <w:b/>
-          <w:bCs/>
-        </w:rPr>
-        <w:t>3: Arquitectura y Calidad de Código</w:t>
+        <w:t>Fecha</w:t>
+      </w:r>
+      <w:r>
+        <w:t xml:space="preserve"> P</w:t>
+      </w:r>
+      <w:r>
+        <w:t>ublicación</w:t>
+      </w:r>
+      <w:r>
+        <w:t>:</w:t>
+      </w:r>
+      <w:r>
+        <w:t xml:space="preserve"> </w:t>
+      </w:r>
+      <w:r>
+        <w:t>date</w:t>
+      </w:r>
+      <w:r>
+        <w:t>, no vac</w:t>
+      </w:r>
+      <w:r>
+        <w:t>í</w:t>
+      </w:r>
+      <w:r>
+        <w:t>o</w:t>
+      </w:r>
+    </w:p>
+    <w:p>
+      <w:pPr>
+        <w:rPr>
+          <w:b/>
+          <w:bCs/>
+        </w:rPr>
+      </w:pPr>
+      <w:r>
+        <w:rPr>
+          <w:b/>
+          <w:bCs/>
+        </w:rPr>
+        <w:t>1.5</w:t>
+      </w:r>
+      <w:r>
+        <w:rPr>
+          <w:b/>
+          <w:bCs/>
+        </w:rPr>
+        <w:t xml:space="preserve"> Arquitectura y Calidad de Código</w:t>
       </w:r>
     </w:p>
     <w:p>
@@ -773,13 +834,16 @@
         <w:t>Patrón de Diseño:</w:t>
       </w:r>
       <w:r>
-        <w:t xml:space="preserve"> Separación clara </w:t>
-      </w:r>
-      <w:r>
-        <w:t>con MVC</w:t>
-      </w:r>
-      <w:r>
-        <w:t>.</w:t>
+        <w:t xml:space="preserve"> Separación </w:t>
+      </w:r>
+      <w:r>
+        <w:t>c</w:t>
+      </w:r>
+      <w:r>
+        <w:t>on MVC</w:t>
+      </w:r>
+      <w:r>
+        <w:t>(Model-View-Controlador)</w:t>
       </w:r>
     </w:p>
     <w:p>
@@ -854,7 +918,13 @@
         <w:t>id</w:t>
       </w:r>
       <w:r>
-        <w:t xml:space="preserve">} -&gt; Consulta detalle de un libro por </w:t>
+        <w:t xml:space="preserve">} -&gt; </w:t>
+      </w:r>
+      <w:r>
+        <w:t>Lee</w:t>
+      </w:r>
+      <w:r>
+        <w:t xml:space="preserve"> detalle de un libro por </w:t>
       </w:r>
       <w:r>
         <w:t>ID</w:t>
@@ -862,7 +932,7 @@
     </w:p>
     <w:p>
       <w:r>
-        <w:t xml:space="preserve"> [PUT] /</w:t>
+        <w:t>[PUT] /</w:t>
       </w:r>
       <w:r>
         <w:t>portal</w:t>
@@ -919,6 +989,942 @@
         <w:t>ID</w:t>
       </w:r>
     </w:p>
+    <w:p/>
+    <w:p/>
+    <w:p/>
+    <w:p>
+      <w:pPr>
+        <w:rPr>
+          <w:b/>
+          <w:bCs/>
+          <w:sz w:val="26"/>
+          <w:szCs w:val="26"/>
+        </w:rPr>
+      </w:pPr>
+      <w:r>
+        <w:rPr>
+          <w:b/>
+          <w:bCs/>
+          <w:sz w:val="26"/>
+          <w:szCs w:val="26"/>
+        </w:rPr>
+        <w:t xml:space="preserve">2 </w:t>
+      </w:r>
+      <w:r>
+        <w:rPr>
+          <w:b/>
+          <w:bCs/>
+          <w:sz w:val="26"/>
+          <w:szCs w:val="26"/>
+        </w:rPr>
+        <w:t>ARQUITECTURA DE SOLUCI</w:t>
+      </w:r>
+      <w:r>
+        <w:rPr>
+          <w:b/>
+          <w:bCs/>
+          <w:sz w:val="26"/>
+          <w:szCs w:val="26"/>
+        </w:rPr>
+        <w:t>Ó</w:t>
+      </w:r>
+      <w:r>
+        <w:rPr>
+          <w:b/>
+          <w:bCs/>
+          <w:sz w:val="26"/>
+          <w:szCs w:val="26"/>
+        </w:rPr>
+        <w:t>N EN 3 CAPAS</w:t>
+      </w:r>
+    </w:p>
+    <w:p>
+      <w:pPr>
+        <w:rPr>
+          <w:sz w:val="20"/>
+          <w:szCs w:val="20"/>
+        </w:rPr>
+      </w:pPr>
+      <w:r>
+        <w:rPr>
+          <w:sz w:val="20"/>
+          <w:szCs w:val="20"/>
+        </w:rPr>
+        <w:t>[ Cliente/</w:t>
+      </w:r>
+      <w:proofErr w:type="spellStart"/>
+      <w:r>
+        <w:rPr>
+          <w:sz w:val="20"/>
+          <w:szCs w:val="20"/>
+        </w:rPr>
+        <w:t>Frontend</w:t>
+      </w:r>
+      <w:proofErr w:type="spellEnd"/>
+      <w:r>
+        <w:rPr>
+          <w:sz w:val="20"/>
+          <w:szCs w:val="20"/>
+        </w:rPr>
+        <w:t>] &lt;-HTTP/JSON-</w:t>
+      </w:r>
+      <w:proofErr w:type="gramStart"/>
+      <w:r>
+        <w:rPr>
+          <w:sz w:val="20"/>
+          <w:szCs w:val="20"/>
+        </w:rPr>
+        <w:t>&gt;[</w:t>
+      </w:r>
+      <w:proofErr w:type="gramEnd"/>
+      <w:r>
+        <w:rPr>
+          <w:sz w:val="20"/>
+          <w:szCs w:val="20"/>
+        </w:rPr>
+        <w:t xml:space="preserve"> API REST/</w:t>
+      </w:r>
+      <w:proofErr w:type="spellStart"/>
+      <w:proofErr w:type="gramStart"/>
+      <w:r>
+        <w:rPr>
+          <w:sz w:val="20"/>
+          <w:szCs w:val="20"/>
+        </w:rPr>
+        <w:t>Backend</w:t>
+      </w:r>
+      <w:proofErr w:type="spellEnd"/>
+      <w:r>
+        <w:rPr>
+          <w:sz w:val="20"/>
+          <w:szCs w:val="20"/>
+        </w:rPr>
+        <w:t xml:space="preserve"> ]</w:t>
+      </w:r>
+      <w:proofErr w:type="gramEnd"/>
+      <w:r>
+        <w:rPr>
+          <w:sz w:val="20"/>
+          <w:szCs w:val="20"/>
+        </w:rPr>
+        <w:t xml:space="preserve"> &lt;</w:t>
+      </w:r>
+      <w:r>
+        <w:rPr>
+          <w:sz w:val="20"/>
+          <w:szCs w:val="20"/>
+        </w:rPr>
+        <w:t xml:space="preserve"> </w:t>
+      </w:r>
+      <w:proofErr w:type="spellStart"/>
+      <w:proofErr w:type="gramStart"/>
+      <w:r>
+        <w:rPr>
+          <w:sz w:val="20"/>
+          <w:szCs w:val="20"/>
+        </w:rPr>
+        <w:t>select,insert</w:t>
+      </w:r>
+      <w:proofErr w:type="gramEnd"/>
+      <w:r>
+        <w:rPr>
+          <w:sz w:val="20"/>
+          <w:szCs w:val="20"/>
+        </w:rPr>
+        <w:t>,</w:t>
+      </w:r>
+      <w:proofErr w:type="gramStart"/>
+      <w:r>
+        <w:rPr>
+          <w:sz w:val="20"/>
+          <w:szCs w:val="20"/>
+        </w:rPr>
+        <w:t>update,delete</w:t>
+      </w:r>
+      <w:proofErr w:type="spellEnd"/>
+      <w:proofErr w:type="gramEnd"/>
+      <w:r>
+        <w:rPr>
+          <w:sz w:val="20"/>
+          <w:szCs w:val="20"/>
+        </w:rPr>
+        <w:t xml:space="preserve"> &gt; [ </w:t>
+      </w:r>
+      <w:proofErr w:type="gramStart"/>
+      <w:r>
+        <w:rPr>
+          <w:sz w:val="20"/>
+          <w:szCs w:val="20"/>
+        </w:rPr>
+        <w:t>BD</w:t>
+      </w:r>
+      <w:r>
+        <w:rPr>
+          <w:sz w:val="20"/>
+          <w:szCs w:val="20"/>
+        </w:rPr>
+        <w:t>D</w:t>
+      </w:r>
+      <w:r>
+        <w:rPr>
+          <w:sz w:val="20"/>
+          <w:szCs w:val="20"/>
+        </w:rPr>
+        <w:t xml:space="preserve"> ]</w:t>
+      </w:r>
+      <w:proofErr w:type="gramEnd"/>
+    </w:p>
+    <w:p>
+      <w:r>
+        <w:t>[</w:t>
+      </w:r>
+      <w:r>
+        <w:t>(</w:t>
+      </w:r>
+      <w:r>
+        <w:t>CSS</w:t>
+      </w:r>
+      <w:r>
+        <w:t>/HTML)</w:t>
+      </w:r>
+      <w:r>
+        <w:t>]</w:t>
+      </w:r>
+      <w:r>
+        <w:t xml:space="preserve">                </w:t>
+      </w:r>
+      <w:r>
+        <w:tab/>
+        <w:t xml:space="preserve">  </w:t>
+      </w:r>
+      <w:proofErr w:type="gramStart"/>
+      <w:r>
+        <w:t xml:space="preserve"> </w:t>
+      </w:r>
+      <w:r>
+        <w:t xml:space="preserve"> </w:t>
+      </w:r>
+      <w:r>
+        <w:t xml:space="preserve"> [</w:t>
+      </w:r>
+      <w:proofErr w:type="gramEnd"/>
+      <w:r>
+        <w:t>Python</w:t>
+      </w:r>
+      <w:r>
+        <w:t xml:space="preserve"> </w:t>
+      </w:r>
+      <w:r>
+        <w:t>F</w:t>
+      </w:r>
+      <w:r>
+        <w:t>lask]</w:t>
+      </w:r>
+      <w:r>
+        <w:t xml:space="preserve">        </w:t>
+      </w:r>
+      <w:r>
+        <w:tab/>
+      </w:r>
+      <w:r>
+        <w:tab/>
+      </w:r>
+      <w:r>
+        <w:tab/>
+        <w:t xml:space="preserve">                 </w:t>
+      </w:r>
+      <w:proofErr w:type="gramStart"/>
+      <w:r>
+        <w:t xml:space="preserve">   [</w:t>
+      </w:r>
+      <w:proofErr w:type="gramEnd"/>
+      <w:r>
+        <w:t>MySQL</w:t>
+      </w:r>
+      <w:r>
+        <w:t>]</w:t>
+      </w:r>
+    </w:p>
+    <w:p>
+      <w:pPr>
+        <w:rPr>
+          <w:b/>
+          <w:bCs/>
+        </w:rPr>
+      </w:pPr>
+      <w:r>
+        <w:rPr>
+          <w:b/>
+          <w:bCs/>
+        </w:rPr>
+        <w:t>Componentes</w:t>
+      </w:r>
+    </w:p>
+    <w:p>
+      <w:pPr>
+        <w:rPr>
+          <w:b/>
+          <w:bCs/>
+        </w:rPr>
+      </w:pPr>
+      <w:r>
+        <w:rPr>
+          <w:b/>
+          <w:bCs/>
+        </w:rPr>
+        <w:t>2.1</w:t>
+      </w:r>
+      <w:r>
+        <w:rPr>
+          <w:b/>
+          <w:bCs/>
+        </w:rPr>
+        <w:t xml:space="preserve"> Capa de Presentación (</w:t>
+      </w:r>
+      <w:proofErr w:type="spellStart"/>
+      <w:r>
+        <w:rPr>
+          <w:b/>
+          <w:bCs/>
+        </w:rPr>
+        <w:t>Frontend</w:t>
+      </w:r>
+      <w:proofErr w:type="spellEnd"/>
+      <w:r>
+        <w:rPr>
+          <w:b/>
+          <w:bCs/>
+        </w:rPr>
+        <w:t xml:space="preserve"> / Cliente)</w:t>
+      </w:r>
+    </w:p>
+    <w:p>
+      <w:pPr>
+        <w:numPr>
+          <w:ilvl w:val="0"/>
+          <w:numId w:val="7"/>
+        </w:numPr>
+      </w:pPr>
+      <w:r>
+        <w:rPr>
+          <w:b/>
+          <w:bCs/>
+        </w:rPr>
+        <w:t>Función:</w:t>
+      </w:r>
+      <w:r>
+        <w:t xml:space="preserve"> Interfaz gráfica para el usuario</w:t>
+      </w:r>
+      <w:r>
+        <w:t xml:space="preserve"> usando CSS Y HTML</w:t>
+      </w:r>
+    </w:p>
+    <w:p>
+      <w:pPr>
+        <w:numPr>
+          <w:ilvl w:val="0"/>
+          <w:numId w:val="7"/>
+        </w:numPr>
+      </w:pPr>
+      <w:r>
+        <w:rPr>
+          <w:b/>
+          <w:bCs/>
+        </w:rPr>
+        <w:t>Una ventada</w:t>
+      </w:r>
+      <w:r>
+        <w:rPr>
+          <w:b/>
+          <w:bCs/>
+        </w:rPr>
+        <w:t xml:space="preserve"> Principal</w:t>
+      </w:r>
+      <w:r>
+        <w:rPr>
+          <w:b/>
+          <w:bCs/>
+        </w:rPr>
+        <w:t xml:space="preserve"> tipo catalogo</w:t>
+      </w:r>
+    </w:p>
+    <w:p>
+      <w:pPr>
+        <w:numPr>
+          <w:ilvl w:val="1"/>
+          <w:numId w:val="7"/>
+        </w:numPr>
+      </w:pPr>
+      <w:proofErr w:type="spellStart"/>
+      <w:r>
+        <w:rPr>
+          <w:b/>
+          <w:bCs/>
+        </w:rPr>
+        <w:lastRenderedPageBreak/>
+        <w:t>Dashboard</w:t>
+      </w:r>
+      <w:proofErr w:type="spellEnd"/>
+      <w:r>
+        <w:rPr>
+          <w:b/>
+          <w:bCs/>
+        </w:rPr>
+        <w:t>/Tabla:</w:t>
+      </w:r>
+      <w:r>
+        <w:t xml:space="preserve"> Lista general de libros con </w:t>
+      </w:r>
+      <w:r>
+        <w:t>cuadro</w:t>
+      </w:r>
+      <w:r>
+        <w:t xml:space="preserve"> de búsqueda rápida (</w:t>
+      </w:r>
+      <w:r>
+        <w:t xml:space="preserve">que </w:t>
+      </w:r>
+      <w:r>
+        <w:t>filtr</w:t>
+      </w:r>
+      <w:r>
+        <w:t>e</w:t>
+      </w:r>
+      <w:r>
+        <w:t xml:space="preserve"> por código, título, autor, género).</w:t>
+      </w:r>
+    </w:p>
+    <w:p>
+      <w:pPr>
+        <w:numPr>
+          <w:ilvl w:val="1"/>
+          <w:numId w:val="7"/>
+        </w:numPr>
+      </w:pPr>
+      <w:r>
+        <w:rPr>
+          <w:b/>
+          <w:bCs/>
+        </w:rPr>
+        <w:t>Formulario de Registro/Edición:</w:t>
+      </w:r>
+      <w:r>
+        <w:t xml:space="preserve"> </w:t>
+      </w:r>
+      <w:r>
+        <w:t>P</w:t>
+      </w:r>
+      <w:r>
+        <w:t>antalla para crear (POST) o editar (PUT) libros.</w:t>
+      </w:r>
+    </w:p>
+    <w:p>
+      <w:pPr>
+        <w:numPr>
+          <w:ilvl w:val="1"/>
+          <w:numId w:val="7"/>
+        </w:numPr>
+      </w:pPr>
+      <w:r>
+        <w:rPr>
+          <w:b/>
+          <w:bCs/>
+        </w:rPr>
+        <w:t>Detalle del Libro:</w:t>
+      </w:r>
+      <w:r>
+        <w:t xml:space="preserve"> Vista modal para consultar los datos completos.</w:t>
+      </w:r>
+    </w:p>
+    <w:p>
+      <w:pPr>
+        <w:numPr>
+          <w:ilvl w:val="1"/>
+          <w:numId w:val="7"/>
+        </w:numPr>
+      </w:pPr>
+      <w:r>
+        <w:rPr>
+          <w:b/>
+          <w:bCs/>
+        </w:rPr>
+        <w:t>Acción de Eliminar:</w:t>
+      </w:r>
+      <w:r>
+        <w:t xml:space="preserve"> Botón con confirmación para prevenir eliminaciones accidentales.</w:t>
+      </w:r>
+    </w:p>
+    <w:p>
+      <w:pPr>
+        <w:rPr>
+          <w:b/>
+          <w:bCs/>
+        </w:rPr>
+      </w:pPr>
+      <w:r>
+        <w:rPr>
+          <w:b/>
+          <w:bCs/>
+        </w:rPr>
+        <w:t>2</w:t>
+      </w:r>
+      <w:r>
+        <w:rPr>
+          <w:b/>
+          <w:bCs/>
+        </w:rPr>
+        <w:t>.2</w:t>
+      </w:r>
+      <w:r>
+        <w:rPr>
+          <w:b/>
+          <w:bCs/>
+        </w:rPr>
+        <w:t xml:space="preserve"> Capa de Negocio / Servidor (</w:t>
+      </w:r>
+      <w:proofErr w:type="spellStart"/>
+      <w:r>
+        <w:rPr>
+          <w:b/>
+          <w:bCs/>
+        </w:rPr>
+        <w:t>Backend</w:t>
+      </w:r>
+      <w:proofErr w:type="spellEnd"/>
+      <w:r>
+        <w:rPr>
+          <w:b/>
+          <w:bCs/>
+        </w:rPr>
+        <w:t xml:space="preserve"> API)</w:t>
+      </w:r>
+    </w:p>
+    <w:p>
+      <w:pPr>
+        <w:numPr>
+          <w:ilvl w:val="0"/>
+          <w:numId w:val="8"/>
+        </w:numPr>
+      </w:pPr>
+      <w:r>
+        <w:rPr>
+          <w:b/>
+          <w:bCs/>
+        </w:rPr>
+        <w:t>Función:</w:t>
+      </w:r>
+      <w:r>
+        <w:t xml:space="preserve"> </w:t>
+      </w:r>
+      <w:r>
+        <w:t>Es la</w:t>
+      </w:r>
+      <w:r>
+        <w:t xml:space="preserve"> lógica </w:t>
+      </w:r>
+      <w:r>
+        <w:t>y reglas del</w:t>
+      </w:r>
+      <w:r>
+        <w:t xml:space="preserve"> negocio y se comunica con la base de datos.</w:t>
+      </w:r>
+    </w:p>
+    <w:p>
+      <w:pPr>
+        <w:numPr>
+          <w:ilvl w:val="0"/>
+          <w:numId w:val="8"/>
+        </w:numPr>
+      </w:pPr>
+      <w:r>
+        <w:rPr>
+          <w:b/>
+          <w:bCs/>
+        </w:rPr>
+        <w:t>Lógica clave (Algoritmo de Código Único):</w:t>
+      </w:r>
+    </w:p>
+    <w:p>
+      <w:pPr>
+        <w:numPr>
+          <w:ilvl w:val="1"/>
+          <w:numId w:val="8"/>
+        </w:numPr>
+      </w:pPr>
+      <w:r>
+        <w:t xml:space="preserve">Al crear un libro, el </w:t>
+      </w:r>
+      <w:proofErr w:type="spellStart"/>
+      <w:r>
+        <w:t>backend</w:t>
+      </w:r>
+      <w:proofErr w:type="spellEnd"/>
+      <w:r>
+        <w:t xml:space="preserve"> genera un código con el formato [A-Z</w:t>
+      </w:r>
+      <w:proofErr w:type="gramStart"/>
+      <w:r>
+        <w:t>][</w:t>
+      </w:r>
+      <w:proofErr w:type="gramEnd"/>
+      <w:r>
+        <w:t>0-9</w:t>
+      </w:r>
+      <w:proofErr w:type="gramStart"/>
+      <w:r>
+        <w:t>][</w:t>
+      </w:r>
+      <w:proofErr w:type="gramEnd"/>
+      <w:r>
+        <w:t>0-9] (ej. A12, B99).</w:t>
+      </w:r>
+    </w:p>
+    <w:p>
+      <w:pPr>
+        <w:numPr>
+          <w:ilvl w:val="1"/>
+          <w:numId w:val="8"/>
+        </w:numPr>
+      </w:pPr>
+      <w:r>
+        <w:rPr>
+          <w:b/>
+          <w:bCs/>
+        </w:rPr>
+        <w:t>Verificación de duplicados:</w:t>
+      </w:r>
+      <w:r>
+        <w:t xml:space="preserve"> La API valida contra la base de datos que el código generado no exista previamente antes de realizar el INSERT. Si existe, </w:t>
+      </w:r>
+      <w:proofErr w:type="spellStart"/>
+      <w:r>
+        <w:t>regener</w:t>
+      </w:r>
+      <w:r>
+        <w:t>á</w:t>
+      </w:r>
+      <w:proofErr w:type="spellEnd"/>
+      <w:r>
+        <w:t xml:space="preserve"> uno nuevo.</w:t>
+      </w:r>
+    </w:p>
+    <w:p>
+      <w:pPr>
+        <w:rPr>
+          <w:b/>
+          <w:bCs/>
+        </w:rPr>
+      </w:pPr>
+      <w:r>
+        <w:rPr>
+          <w:b/>
+          <w:bCs/>
+        </w:rPr>
+        <w:t>2.</w:t>
+      </w:r>
+      <w:r>
+        <w:rPr>
+          <w:b/>
+          <w:bCs/>
+        </w:rPr>
+        <w:t>3 Capa de Datos (Base de Datos / MySQL)</w:t>
+      </w:r>
+    </w:p>
+    <w:p>
+      <w:pPr>
+        <w:numPr>
+          <w:ilvl w:val="0"/>
+          <w:numId w:val="9"/>
+        </w:numPr>
+      </w:pPr>
+      <w:r>
+        <w:rPr>
+          <w:b/>
+          <w:bCs/>
+        </w:rPr>
+        <w:t>Función:</w:t>
+      </w:r>
+      <w:r>
+        <w:t xml:space="preserve"> Almacenamiento </w:t>
+      </w:r>
+      <w:r>
+        <w:t xml:space="preserve">en una tabla llamada </w:t>
+      </w:r>
+      <w:proofErr w:type="spellStart"/>
+      <w:r>
+        <w:t>books</w:t>
+      </w:r>
+      <w:proofErr w:type="spellEnd"/>
+      <w:r>
+        <w:t>.</w:t>
+      </w:r>
+    </w:p>
+    <w:p>
+      <w:pPr>
+        <w:numPr>
+          <w:ilvl w:val="0"/>
+          <w:numId w:val="9"/>
+        </w:numPr>
+      </w:pPr>
+      <w:r>
+        <w:rPr>
+          <w:b/>
+          <w:bCs/>
+        </w:rPr>
+        <w:t xml:space="preserve">Diseño de la Tabla </w:t>
+      </w:r>
+      <w:proofErr w:type="spellStart"/>
+      <w:r>
+        <w:rPr>
+          <w:b/>
+          <w:bCs/>
+        </w:rPr>
+        <w:t>books</w:t>
+      </w:r>
+      <w:proofErr w:type="spellEnd"/>
+      <w:r>
+        <w:rPr>
+          <w:b/>
+          <w:bCs/>
+        </w:rPr>
+        <w:t>:</w:t>
+      </w:r>
+    </w:p>
+    <w:p>
+      <w:r>
+        <w:drawing>
+          <wp:inline distT="0" distB="0" distL="0" distR="0" wp14:anchorId="0512A086" wp14:editId="7E65AB91">
+            <wp:extent cx="5612130" cy="1221740"/>
+            <wp:effectExtent l="0" t="0" r="7620" b="0"/>
+            <wp:docPr id="510309191" name="Imagen 1"/>
+            <wp:cNvGraphicFramePr>
+              <a:graphicFrameLocks xmlns:a="http://schemas.openxmlformats.org/drawingml/2006/main" noChangeAspect="1"/>
+            </wp:cNvGraphicFramePr>
+            <a:graphic xmlns:a="http://schemas.openxmlformats.org/drawingml/2006/main">
+              <a:graphicData uri="http://schemas.openxmlformats.org/drawingml/2006/picture">
+                <pic:pic xmlns:pic="http://schemas.openxmlformats.org/drawingml/2006/picture">
+                  <pic:nvPicPr>
+                    <pic:cNvPr id="510309191" name=""/>
+                    <pic:cNvPicPr/>
+                  </pic:nvPicPr>
+                  <pic:blipFill>
+                    <a:blip r:embed="rId5"/>
+                    <a:stretch>
+                      <a:fillRect/>
+                    </a:stretch>
+                  </pic:blipFill>
+                  <pic:spPr>
+                    <a:xfrm>
+                      <a:off x="0" y="0"/>
+                      <a:ext cx="5612130" cy="1221740"/>
+                    </a:xfrm>
+                    <a:prstGeom prst="rect">
+                      <a:avLst/>
+                    </a:prstGeom>
+                  </pic:spPr>
+                </pic:pic>
+              </a:graphicData>
+            </a:graphic>
+          </wp:inline>
+        </w:drawing>
+      </w:r>
+    </w:p>
+    <w:p>
+      <w:r>
+        <w:drawing>
+          <wp:inline distT="0" distB="0" distL="0" distR="0" wp14:anchorId="0F462CE2" wp14:editId="432ED33A">
+            <wp:extent cx="5612130" cy="712470"/>
+            <wp:effectExtent l="0" t="0" r="7620" b="0"/>
+            <wp:docPr id="826335194" name="Imagen 1"/>
+            <wp:cNvGraphicFramePr>
+              <a:graphicFrameLocks xmlns:a="http://schemas.openxmlformats.org/drawingml/2006/main" noChangeAspect="1"/>
+            </wp:cNvGraphicFramePr>
+            <a:graphic xmlns:a="http://schemas.openxmlformats.org/drawingml/2006/main">
+              <a:graphicData uri="http://schemas.openxmlformats.org/drawingml/2006/picture">
+                <pic:pic xmlns:pic="http://schemas.openxmlformats.org/drawingml/2006/picture">
+                  <pic:nvPicPr>
+                    <pic:cNvPr id="826335194" name=""/>
+                    <pic:cNvPicPr/>
+                  </pic:nvPicPr>
+                  <pic:blipFill>
+                    <a:blip r:embed="rId6"/>
+                    <a:stretch>
+                      <a:fillRect/>
+                    </a:stretch>
+                  </pic:blipFill>
+                  <pic:spPr>
+                    <a:xfrm>
+                      <a:off x="0" y="0"/>
+                      <a:ext cx="5612130" cy="712470"/>
+                    </a:xfrm>
+                    <a:prstGeom prst="rect">
+                      <a:avLst/>
+                    </a:prstGeom>
+                  </pic:spPr>
+                </pic:pic>
+              </a:graphicData>
+            </a:graphic>
+          </wp:inline>
+        </w:drawing>
+      </w:r>
+    </w:p>
+    <w:p>
+      <w:pPr>
+        <w:numPr>
+          <w:ilvl w:val="0"/>
+          <w:numId w:val="9"/>
+        </w:numPr>
+      </w:pPr>
+      <w:r>
+        <w:rPr>
+          <w:b/>
+          <w:bCs/>
+        </w:rPr>
+        <w:t>T</w:t>
+      </w:r>
+      <w:r>
+        <w:rPr>
+          <w:b/>
+          <w:bCs/>
+        </w:rPr>
+        <w:t>ecnológico Sugerid</w:t>
+      </w:r>
+      <w:r>
+        <w:rPr>
+          <w:b/>
+          <w:bCs/>
+        </w:rPr>
+        <w:t>a</w:t>
+      </w:r>
+    </w:p>
+    <w:p>
+      <w:pPr>
+        <w:ind w:left="708"/>
+      </w:pPr>
+      <w:r>
+        <w:t>Para llevar esta arquitectura a código de forma rápida</w:t>
+      </w:r>
+      <w:r>
+        <w:t xml:space="preserve"> y por el tipo de proyecto</w:t>
+      </w:r>
+      <w:r>
+        <w:t xml:space="preserve">, </w:t>
+      </w:r>
+      <w:r>
+        <w:t>se recomienda usar Python, MySQL y HTML/CSS/JS</w:t>
+      </w:r>
+    </w:p>
+    <w:p>
+      <w:pPr>
+        <w:rPr>
+          <w:b/>
+          <w:bCs/>
+        </w:rPr>
+      </w:pPr>
+      <w:r>
+        <w:rPr>
+          <w:b/>
+          <w:bCs/>
+        </w:rPr>
+        <w:lastRenderedPageBreak/>
+        <w:t>3 JUSTIFICACION</w:t>
+      </w:r>
+    </w:p>
+    <w:p>
+      <w:pPr>
+        <w:jc w:val="both"/>
+        <w:rPr>
+          <w:sz w:val="22"/>
+          <w:szCs w:val="22"/>
+        </w:rPr>
+      </w:pPr>
+      <w:r>
+        <w:rPr>
+          <w:sz w:val="22"/>
+          <w:szCs w:val="22"/>
+        </w:rPr>
+        <w:t>La implementación de este sistema CRUD responde a la necesidad fundamental de la biblioteca de digitalizar, centralizar y automatizar la gestión de su inventario</w:t>
+      </w:r>
+      <w:r>
+        <w:rPr>
+          <w:sz w:val="22"/>
+          <w:szCs w:val="22"/>
+        </w:rPr>
+        <w:t xml:space="preserve"> de libros</w:t>
+      </w:r>
+      <w:r>
+        <w:rPr>
+          <w:sz w:val="22"/>
+          <w:szCs w:val="22"/>
+        </w:rPr>
+        <w:t>. La transición de un registro manual a una solución web estructurada elimina la duplicidad de datos, reduce el tiempo de búsqueda para los usuarios y garantiza la integridad de la información almacenada</w:t>
+      </w:r>
+      <w:r>
+        <w:rPr>
+          <w:sz w:val="22"/>
+          <w:szCs w:val="22"/>
+        </w:rPr>
+        <w:t>, además de que se tiene una gran escalabilidad.</w:t>
+      </w:r>
+    </w:p>
+    <w:p>
+      <w:pPr>
+        <w:jc w:val="both"/>
+        <w:rPr>
+          <w:sz w:val="22"/>
+          <w:szCs w:val="22"/>
+        </w:rPr>
+      </w:pPr>
+    </w:p>
+    <w:p>
+      <w:pPr>
+        <w:rPr>
+          <w:b/>
+          <w:bCs/>
+        </w:rPr>
+      </w:pPr>
+      <w:r>
+        <w:rPr>
+          <w:b/>
+          <w:bCs/>
+        </w:rPr>
+        <w:t xml:space="preserve">4 </w:t>
+      </w:r>
+      <w:proofErr w:type="gramStart"/>
+      <w:r>
+        <w:rPr>
+          <w:b/>
+          <w:bCs/>
+        </w:rPr>
+        <w:t>D</w:t>
+      </w:r>
+      <w:r>
+        <w:rPr>
+          <w:b/>
+          <w:bCs/>
+        </w:rPr>
+        <w:t>ocumentación</w:t>
+      </w:r>
+      <w:proofErr w:type="gramEnd"/>
+      <w:r>
+        <w:rPr>
+          <w:b/>
+          <w:bCs/>
+        </w:rPr>
+        <w:t xml:space="preserve"> de los componentes (Entradas y Salidas de datos)</w:t>
+      </w:r>
+    </w:p>
+    <w:p>
+      <w:pPr>
+        <w:jc w:val="both"/>
+        <w:rPr>
+          <w:b/>
+          <w:bCs/>
+        </w:rPr>
+      </w:pPr>
+    </w:p>
+    <w:p/>
+    <w:p/>
     <w:sectPr>
       <w:pgSz w:w="12240" w:h="15840"/>
       <w:pgMar w:top="1417" w:right="1701" w:bottom="1417" w:left="1701" w:header="708" w:footer="708" w:gutter="0"/>
@@ -1230,6 +2236,155 @@
     </w:lvl>
   </w:abstractNum>
   <w:abstractNum w:abstractNumId="2" w15:restartNumberingAfterBreak="0">
+    <w:nsid w:val="26E02332"/>
+    <w:multiLevelType w:val="multilevel"/>
+    <w:tmpl w:val="C0EA4D9A"/>
+    <w:lvl w:ilvl="0">
+      <w:start w:val="1"/>
+      <w:numFmt w:val="bullet"/>
+      <w:lvlText w:val=""/>
+      <w:lvlJc w:val="left"/>
+      <w:pPr>
+        <w:tabs>
+          <w:tab w:val="num" w:pos="720"/>
+        </w:tabs>
+        <w:ind w:left="720" w:hanging="360"/>
+      </w:pPr>
+      <w:rPr>
+        <w:rFonts w:ascii="Symbol" w:hAnsi="Symbol" w:hint="default"/>
+        <w:sz w:val="20"/>
+      </w:rPr>
+    </w:lvl>
+    <w:lvl w:ilvl="1">
+      <w:start w:val="1"/>
+      <w:numFmt w:val="bullet"/>
+      <w:lvlText w:val="o"/>
+      <w:lvlJc w:val="left"/>
+      <w:pPr>
+        <w:tabs>
+          <w:tab w:val="num" w:pos="1440"/>
+        </w:tabs>
+        <w:ind w:left="1440" w:hanging="360"/>
+      </w:pPr>
+      <w:rPr>
+        <w:rFonts w:ascii="Courier New" w:hAnsi="Courier New" w:hint="default"/>
+        <w:sz w:val="20"/>
+      </w:rPr>
+    </w:lvl>
+    <w:lvl w:ilvl="2" w:tentative="1">
+      <w:start w:val="1"/>
+      <w:numFmt w:val="bullet"/>
+      <w:lvlText w:val=""/>
+      <w:lvlJc w:val="left"/>
+      <w:pPr>
+        <w:tabs>
+          <w:tab w:val="num" w:pos="2160"/>
+        </w:tabs>
+        <w:ind w:left="2160" w:hanging="360"/>
+      </w:pPr>
+      <w:rPr>
+        <w:rFonts w:ascii="Wingdings" w:hAnsi="Wingdings" w:hint="default"/>
+        <w:sz w:val="20"/>
+      </w:rPr>
+    </w:lvl>
+    <w:lvl w:ilvl="3" w:tentative="1">
+      <w:start w:val="1"/>
+      <w:numFmt w:val="bullet"/>
+      <w:lvlText w:val=""/>
+      <w:lvlJc w:val="left"/>
+      <w:pPr>
+        <w:tabs>
+          <w:tab w:val="num" w:pos="2880"/>
+        </w:tabs>
+        <w:ind w:left="2880" w:hanging="360"/>
+      </w:pPr>
+      <w:rPr>
+        <w:rFonts w:ascii="Wingdings" w:hAnsi="Wingdings" w:hint="default"/>
+        <w:sz w:val="20"/>
+      </w:rPr>
+    </w:lvl>
+    <w:lvl w:ilvl="4" w:tentative="1">
+      <w:start w:val="1"/>
+      <w:numFmt w:val="bullet"/>
+      <w:lvlText w:val=""/>
+      <w:lvlJc w:val="left"/>
+      <w:pPr>
+        <w:tabs>
+          <w:tab w:val="num" w:pos="3600"/>
+        </w:tabs>
+        <w:ind w:left="3600" w:hanging="360"/>
+      </w:pPr>
+      <w:rPr>
+        <w:rFonts w:ascii="Wingdings" w:hAnsi="Wingdings" w:hint="default"/>
+        <w:sz w:val="20"/>
+      </w:rPr>
+    </w:lvl>
+    <w:lvl w:ilvl="5" w:tentative="1">
+      <w:start w:val="1"/>
+      <w:numFmt w:val="bullet"/>
+      <w:lvlText w:val=""/>
+      <w:lvlJc w:val="left"/>
+      <w:pPr>
+        <w:tabs>
+          <w:tab w:val="num" w:pos="4320"/>
+        </w:tabs>
+        <w:ind w:left="4320" w:hanging="360"/>
+      </w:pPr>
+      <w:rPr>
+        <w:rFonts w:ascii="Wingdings" w:hAnsi="Wingdings" w:hint="default"/>
+        <w:sz w:val="20"/>
+      </w:rPr>
+    </w:lvl>
+    <w:lvl w:ilvl="6" w:tentative="1">
+      <w:start w:val="1"/>
+      <w:numFmt w:val="bullet"/>
+      <w:lvlText w:val=""/>
+      <w:lvlJc w:val="left"/>
+      <w:pPr>
+        <w:tabs>
+          <w:tab w:val="num" w:pos="5040"/>
+        </w:tabs>
+        <w:ind w:left="5040" w:hanging="360"/>
+      </w:pPr>
+      <w:rPr>
+        <w:rFonts w:ascii="Wingdings" w:hAnsi="Wingdings" w:hint="default"/>
+        <w:sz w:val="20"/>
+      </w:rPr>
+    </w:lvl>
+    <w:lvl w:ilvl="7" w:tentative="1">
+      <w:start w:val="1"/>
+      <w:numFmt w:val="bullet"/>
+      <w:lvlText w:val=""/>
+      <w:lvlJc w:val="left"/>
+      <w:pPr>
+        <w:tabs>
+          <w:tab w:val="num" w:pos="5760"/>
+        </w:tabs>
+        <w:ind w:left="5760" w:hanging="360"/>
+      </w:pPr>
+      <w:rPr>
+        <w:rFonts w:ascii="Wingdings" w:hAnsi="Wingdings" w:hint="default"/>
+        <w:sz w:val="20"/>
+      </w:rPr>
+    </w:lvl>
+    <w:lvl w:ilvl="8" w:tentative="1">
+      <w:start w:val="1"/>
+      <w:numFmt w:val="bullet"/>
+      <w:lvlText w:val=""/>
+      <w:lvlJc w:val="left"/>
+      <w:pPr>
+        <w:tabs>
+          <w:tab w:val="num" w:pos="6480"/>
+        </w:tabs>
+        <w:ind w:left="6480" w:hanging="360"/>
+      </w:pPr>
+      <w:rPr>
+        <w:rFonts w:ascii="Wingdings" w:hAnsi="Wingdings" w:hint="default"/>
+        <w:sz w:val="20"/>
+      </w:rPr>
+    </w:lvl>
+  </w:abstractNum>
+  <w:abstractNum w:abstractNumId="3" w15:restartNumberingAfterBreak="0">
     <w:nsid w:val="30C1172E"/>
     <w:multiLevelType w:val="multilevel"/>
     <w:tmpl w:val="F5B852F6"/>
@@ -1378,7 +2533,7 @@
       </w:rPr>
     </w:lvl>
   </w:abstractNum>
-  <w:abstractNum w:abstractNumId="3" w15:restartNumberingAfterBreak="0">
+  <w:abstractNum w:abstractNumId="4" w15:restartNumberingAfterBreak="0">
     <w:nsid w:val="382E7FDD"/>
     <w:multiLevelType w:val="multilevel"/>
     <w:tmpl w:val="10665E3A"/>
@@ -1527,7 +2682,156 @@
       </w:rPr>
     </w:lvl>
   </w:abstractNum>
-  <w:abstractNum w:abstractNumId="4" w15:restartNumberingAfterBreak="0">
+  <w:abstractNum w:abstractNumId="5" w15:restartNumberingAfterBreak="0">
+    <w:nsid w:val="45231114"/>
+    <w:multiLevelType w:val="multilevel"/>
+    <w:tmpl w:val="E0FCABFA"/>
+    <w:lvl w:ilvl="0">
+      <w:start w:val="1"/>
+      <w:numFmt w:val="bullet"/>
+      <w:lvlText w:val=""/>
+      <w:lvlJc w:val="left"/>
+      <w:pPr>
+        <w:tabs>
+          <w:tab w:val="num" w:pos="720"/>
+        </w:tabs>
+        <w:ind w:left="720" w:hanging="360"/>
+      </w:pPr>
+      <w:rPr>
+        <w:rFonts w:ascii="Symbol" w:hAnsi="Symbol" w:hint="default"/>
+        <w:sz w:val="20"/>
+      </w:rPr>
+    </w:lvl>
+    <w:lvl w:ilvl="1" w:tentative="1">
+      <w:start w:val="1"/>
+      <w:numFmt w:val="bullet"/>
+      <w:lvlText w:val="o"/>
+      <w:lvlJc w:val="left"/>
+      <w:pPr>
+        <w:tabs>
+          <w:tab w:val="num" w:pos="1440"/>
+        </w:tabs>
+        <w:ind w:left="1440" w:hanging="360"/>
+      </w:pPr>
+      <w:rPr>
+        <w:rFonts w:ascii="Courier New" w:hAnsi="Courier New" w:hint="default"/>
+        <w:sz w:val="20"/>
+      </w:rPr>
+    </w:lvl>
+    <w:lvl w:ilvl="2" w:tentative="1">
+      <w:start w:val="1"/>
+      <w:numFmt w:val="bullet"/>
+      <w:lvlText w:val=""/>
+      <w:lvlJc w:val="left"/>
+      <w:pPr>
+        <w:tabs>
+          <w:tab w:val="num" w:pos="2160"/>
+        </w:tabs>
+        <w:ind w:left="2160" w:hanging="360"/>
+      </w:pPr>
+      <w:rPr>
+        <w:rFonts w:ascii="Wingdings" w:hAnsi="Wingdings" w:hint="default"/>
+        <w:sz w:val="20"/>
+      </w:rPr>
+    </w:lvl>
+    <w:lvl w:ilvl="3" w:tentative="1">
+      <w:start w:val="1"/>
+      <w:numFmt w:val="bullet"/>
+      <w:lvlText w:val=""/>
+      <w:lvlJc w:val="left"/>
+      <w:pPr>
+        <w:tabs>
+          <w:tab w:val="num" w:pos="2880"/>
+        </w:tabs>
+        <w:ind w:left="2880" w:hanging="360"/>
+      </w:pPr>
+      <w:rPr>
+        <w:rFonts w:ascii="Wingdings" w:hAnsi="Wingdings" w:hint="default"/>
+        <w:sz w:val="20"/>
+      </w:rPr>
+    </w:lvl>
+    <w:lvl w:ilvl="4" w:tentative="1">
+      <w:start w:val="1"/>
+      <w:numFmt w:val="bullet"/>
+      <w:lvlText w:val=""/>
+      <w:lvlJc w:val="left"/>
+      <w:pPr>
+        <w:tabs>
+          <w:tab w:val="num" w:pos="3600"/>
+        </w:tabs>
+        <w:ind w:left="3600" w:hanging="360"/>
+      </w:pPr>
+      <w:rPr>
+        <w:rFonts w:ascii="Wingdings" w:hAnsi="Wingdings" w:hint="default"/>
+        <w:sz w:val="20"/>
+      </w:rPr>
+    </w:lvl>
+    <w:lvl w:ilvl="5" w:tentative="1">
+      <w:start w:val="1"/>
+      <w:numFmt w:val="bullet"/>
+      <w:lvlText w:val=""/>
+      <w:lvlJc w:val="left"/>
+      <w:pPr>
+        <w:tabs>
+          <w:tab w:val="num" w:pos="4320"/>
+        </w:tabs>
+        <w:ind w:left="4320" w:hanging="360"/>
+      </w:pPr>
+      <w:rPr>
+        <w:rFonts w:ascii="Wingdings" w:hAnsi="Wingdings" w:hint="default"/>
+        <w:sz w:val="20"/>
+      </w:rPr>
+    </w:lvl>
+    <w:lvl w:ilvl="6" w:tentative="1">
+      <w:start w:val="1"/>
+      <w:numFmt w:val="bullet"/>
+      <w:lvlText w:val=""/>
+      <w:lvlJc w:val="left"/>
+      <w:pPr>
+        <w:tabs>
+          <w:tab w:val="num" w:pos="5040"/>
+        </w:tabs>
+        <w:ind w:left="5040" w:hanging="360"/>
+      </w:pPr>
+      <w:rPr>
+        <w:rFonts w:ascii="Wingdings" w:hAnsi="Wingdings" w:hint="default"/>
+        <w:sz w:val="20"/>
+      </w:rPr>
+    </w:lvl>
+    <w:lvl w:ilvl="7" w:tentative="1">
+      <w:start w:val="1"/>
+      <w:numFmt w:val="bullet"/>
+      <w:lvlText w:val=""/>
+      <w:lvlJc w:val="left"/>
+      <w:pPr>
+        <w:tabs>
+          <w:tab w:val="num" w:pos="5760"/>
+        </w:tabs>
+        <w:ind w:left="5760" w:hanging="360"/>
+      </w:pPr>
+      <w:rPr>
+        <w:rFonts w:ascii="Wingdings" w:hAnsi="Wingdings" w:hint="default"/>
+        <w:sz w:val="20"/>
+      </w:rPr>
+    </w:lvl>
+    <w:lvl w:ilvl="8" w:tentative="1">
+      <w:start w:val="1"/>
+      <w:numFmt w:val="bullet"/>
+      <w:lvlText w:val=""/>
+      <w:lvlJc w:val="left"/>
+      <w:pPr>
+        <w:tabs>
+          <w:tab w:val="num" w:pos="6480"/>
+        </w:tabs>
+        <w:ind w:left="6480" w:hanging="360"/>
+      </w:pPr>
+      <w:rPr>
+        <w:rFonts w:ascii="Wingdings" w:hAnsi="Wingdings" w:hint="default"/>
+        <w:sz w:val="20"/>
+      </w:rPr>
+    </w:lvl>
+  </w:abstractNum>
+  <w:abstractNum w:abstractNumId="6" w15:restartNumberingAfterBreak="0">
     <w:nsid w:val="5A8735ED"/>
     <w:multiLevelType w:val="multilevel"/>
     <w:tmpl w:val="F182A058"/>
@@ -1676,7 +2980,305 @@
       </w:rPr>
     </w:lvl>
   </w:abstractNum>
-  <w:abstractNum w:abstractNumId="5" w15:restartNumberingAfterBreak="0">
+  <w:abstractNum w:abstractNumId="7" w15:restartNumberingAfterBreak="0">
+    <w:nsid w:val="611365D4"/>
+    <w:multiLevelType w:val="multilevel"/>
+    <w:tmpl w:val="7AA23C38"/>
+    <w:lvl w:ilvl="0">
+      <w:start w:val="1"/>
+      <w:numFmt w:val="bullet"/>
+      <w:lvlText w:val=""/>
+      <w:lvlJc w:val="left"/>
+      <w:pPr>
+        <w:tabs>
+          <w:tab w:val="num" w:pos="720"/>
+        </w:tabs>
+        <w:ind w:left="720" w:hanging="360"/>
+      </w:pPr>
+      <w:rPr>
+        <w:rFonts w:ascii="Symbol" w:hAnsi="Symbol" w:hint="default"/>
+        <w:sz w:val="20"/>
+      </w:rPr>
+    </w:lvl>
+    <w:lvl w:ilvl="1" w:tentative="1">
+      <w:start w:val="1"/>
+      <w:numFmt w:val="bullet"/>
+      <w:lvlText w:val="o"/>
+      <w:lvlJc w:val="left"/>
+      <w:pPr>
+        <w:tabs>
+          <w:tab w:val="num" w:pos="1440"/>
+        </w:tabs>
+        <w:ind w:left="1440" w:hanging="360"/>
+      </w:pPr>
+      <w:rPr>
+        <w:rFonts w:ascii="Courier New" w:hAnsi="Courier New" w:hint="default"/>
+        <w:sz w:val="20"/>
+      </w:rPr>
+    </w:lvl>
+    <w:lvl w:ilvl="2" w:tentative="1">
+      <w:start w:val="1"/>
+      <w:numFmt w:val="bullet"/>
+      <w:lvlText w:val=""/>
+      <w:lvlJc w:val="left"/>
+      <w:pPr>
+        <w:tabs>
+          <w:tab w:val="num" w:pos="2160"/>
+        </w:tabs>
+        <w:ind w:left="2160" w:hanging="360"/>
+      </w:pPr>
+      <w:rPr>
+        <w:rFonts w:ascii="Wingdings" w:hAnsi="Wingdings" w:hint="default"/>
+        <w:sz w:val="20"/>
+      </w:rPr>
+    </w:lvl>
+    <w:lvl w:ilvl="3" w:tentative="1">
+      <w:start w:val="1"/>
+      <w:numFmt w:val="bullet"/>
+      <w:lvlText w:val=""/>
+      <w:lvlJc w:val="left"/>
+      <w:pPr>
+        <w:tabs>
+          <w:tab w:val="num" w:pos="2880"/>
+        </w:tabs>
+        <w:ind w:left="2880" w:hanging="360"/>
+      </w:pPr>
+      <w:rPr>
+        <w:rFonts w:ascii="Wingdings" w:hAnsi="Wingdings" w:hint="default"/>
+        <w:sz w:val="20"/>
+      </w:rPr>
+    </w:lvl>
+    <w:lvl w:ilvl="4" w:tentative="1">
+      <w:start w:val="1"/>
+      <w:numFmt w:val="bullet"/>
+      <w:lvlText w:val=""/>
+      <w:lvlJc w:val="left"/>
+      <w:pPr>
+        <w:tabs>
+          <w:tab w:val="num" w:pos="3600"/>
+        </w:tabs>
+        <w:ind w:left="3600" w:hanging="360"/>
+      </w:pPr>
+      <w:rPr>
+        <w:rFonts w:ascii="Wingdings" w:hAnsi="Wingdings" w:hint="default"/>
+        <w:sz w:val="20"/>
+      </w:rPr>
+    </w:lvl>
+    <w:lvl w:ilvl="5" w:tentative="1">
+      <w:start w:val="1"/>
+      <w:numFmt w:val="bullet"/>
+      <w:lvlText w:val=""/>
+      <w:lvlJc w:val="left"/>
+      <w:pPr>
+        <w:tabs>
+          <w:tab w:val="num" w:pos="4320"/>
+        </w:tabs>
+        <w:ind w:left="4320" w:hanging="360"/>
+      </w:pPr>
+      <w:rPr>
+        <w:rFonts w:ascii="Wingdings" w:hAnsi="Wingdings" w:hint="default"/>
+        <w:sz w:val="20"/>
+      </w:rPr>
+    </w:lvl>
+    <w:lvl w:ilvl="6" w:tentative="1">
+      <w:start w:val="1"/>
+      <w:numFmt w:val="bullet"/>
+      <w:lvlText w:val=""/>
+      <w:lvlJc w:val="left"/>
+      <w:pPr>
+        <w:tabs>
+          <w:tab w:val="num" w:pos="5040"/>
+        </w:tabs>
+        <w:ind w:left="5040" w:hanging="360"/>
+      </w:pPr>
+      <w:rPr>
+        <w:rFonts w:ascii="Wingdings" w:hAnsi="Wingdings" w:hint="default"/>
+        <w:sz w:val="20"/>
+      </w:rPr>
+    </w:lvl>
+    <w:lvl w:ilvl="7" w:tentative="1">
+      <w:start w:val="1"/>
+      <w:numFmt w:val="bullet"/>
+      <w:lvlText w:val=""/>
+      <w:lvlJc w:val="left"/>
+      <w:pPr>
+        <w:tabs>
+          <w:tab w:val="num" w:pos="5760"/>
+        </w:tabs>
+        <w:ind w:left="5760" w:hanging="360"/>
+      </w:pPr>
+      <w:rPr>
+        <w:rFonts w:ascii="Wingdings" w:hAnsi="Wingdings" w:hint="default"/>
+        <w:sz w:val="20"/>
+      </w:rPr>
+    </w:lvl>
+    <w:lvl w:ilvl="8" w:tentative="1">
+      <w:start w:val="1"/>
+      <w:numFmt w:val="bullet"/>
+      <w:lvlText w:val=""/>
+      <w:lvlJc w:val="left"/>
+      <w:pPr>
+        <w:tabs>
+          <w:tab w:val="num" w:pos="6480"/>
+        </w:tabs>
+        <w:ind w:left="6480" w:hanging="360"/>
+      </w:pPr>
+      <w:rPr>
+        <w:rFonts w:ascii="Wingdings" w:hAnsi="Wingdings" w:hint="default"/>
+        <w:sz w:val="20"/>
+      </w:rPr>
+    </w:lvl>
+  </w:abstractNum>
+  <w:abstractNum w:abstractNumId="8" w15:restartNumberingAfterBreak="0">
+    <w:nsid w:val="7C5522DB"/>
+    <w:multiLevelType w:val="multilevel"/>
+    <w:tmpl w:val="E8EA018E"/>
+    <w:lvl w:ilvl="0">
+      <w:start w:val="1"/>
+      <w:numFmt w:val="bullet"/>
+      <w:lvlText w:val=""/>
+      <w:lvlJc w:val="left"/>
+      <w:pPr>
+        <w:tabs>
+          <w:tab w:val="num" w:pos="720"/>
+        </w:tabs>
+        <w:ind w:left="720" w:hanging="360"/>
+      </w:pPr>
+      <w:rPr>
+        <w:rFonts w:ascii="Symbol" w:hAnsi="Symbol" w:hint="default"/>
+        <w:sz w:val="20"/>
+      </w:rPr>
+    </w:lvl>
+    <w:lvl w:ilvl="1">
+      <w:start w:val="1"/>
+      <w:numFmt w:val="bullet"/>
+      <w:lvlText w:val="o"/>
+      <w:lvlJc w:val="left"/>
+      <w:pPr>
+        <w:tabs>
+          <w:tab w:val="num" w:pos="1440"/>
+        </w:tabs>
+        <w:ind w:left="1440" w:hanging="360"/>
+      </w:pPr>
+      <w:rPr>
+        <w:rFonts w:ascii="Courier New" w:hAnsi="Courier New" w:hint="default"/>
+        <w:sz w:val="20"/>
+      </w:rPr>
+    </w:lvl>
+    <w:lvl w:ilvl="2" w:tentative="1">
+      <w:start w:val="1"/>
+      <w:numFmt w:val="bullet"/>
+      <w:lvlText w:val=""/>
+      <w:lvlJc w:val="left"/>
+      <w:pPr>
+        <w:tabs>
+          <w:tab w:val="num" w:pos="2160"/>
+        </w:tabs>
+        <w:ind w:left="2160" w:hanging="360"/>
+      </w:pPr>
+      <w:rPr>
+        <w:rFonts w:ascii="Wingdings" w:hAnsi="Wingdings" w:hint="default"/>
+        <w:sz w:val="20"/>
+      </w:rPr>
+    </w:lvl>
+    <w:lvl w:ilvl="3" w:tentative="1">
+      <w:start w:val="1"/>
+      <w:numFmt w:val="bullet"/>
+      <w:lvlText w:val=""/>
+      <w:lvlJc w:val="left"/>
+      <w:pPr>
+        <w:tabs>
+          <w:tab w:val="num" w:pos="2880"/>
+        </w:tabs>
+        <w:ind w:left="2880" w:hanging="360"/>
+      </w:pPr>
+      <w:rPr>
+        <w:rFonts w:ascii="Wingdings" w:hAnsi="Wingdings" w:hint="default"/>
+        <w:sz w:val="20"/>
+      </w:rPr>
+    </w:lvl>
+    <w:lvl w:ilvl="4" w:tentative="1">
+      <w:start w:val="1"/>
+      <w:numFmt w:val="bullet"/>
+      <w:lvlText w:val=""/>
+      <w:lvlJc w:val="left"/>
+      <w:pPr>
+        <w:tabs>
+          <w:tab w:val="num" w:pos="3600"/>
+        </w:tabs>
+        <w:ind w:left="3600" w:hanging="360"/>
+      </w:pPr>
+      <w:rPr>
+        <w:rFonts w:ascii="Wingdings" w:hAnsi="Wingdings" w:hint="default"/>
+        <w:sz w:val="20"/>
+      </w:rPr>
+    </w:lvl>
+    <w:lvl w:ilvl="5" w:tentative="1">
+      <w:start w:val="1"/>
+      <w:numFmt w:val="bullet"/>
+      <w:lvlText w:val=""/>
+      <w:lvlJc w:val="left"/>
+      <w:pPr>
+        <w:tabs>
+          <w:tab w:val="num" w:pos="4320"/>
+        </w:tabs>
+        <w:ind w:left="4320" w:hanging="360"/>
+      </w:pPr>
+      <w:rPr>
+        <w:rFonts w:ascii="Wingdings" w:hAnsi="Wingdings" w:hint="default"/>
+        <w:sz w:val="20"/>
+      </w:rPr>
+    </w:lvl>
+    <w:lvl w:ilvl="6" w:tentative="1">
+      <w:start w:val="1"/>
+      <w:numFmt w:val="bullet"/>
+      <w:lvlText w:val=""/>
+      <w:lvlJc w:val="left"/>
+      <w:pPr>
+        <w:tabs>
+          <w:tab w:val="num" w:pos="5040"/>
+        </w:tabs>
+        <w:ind w:left="5040" w:hanging="360"/>
+      </w:pPr>
+      <w:rPr>
+        <w:rFonts w:ascii="Wingdings" w:hAnsi="Wingdings" w:hint="default"/>
+        <w:sz w:val="20"/>
+      </w:rPr>
+    </w:lvl>
+    <w:lvl w:ilvl="7" w:tentative="1">
+      <w:start w:val="1"/>
+      <w:numFmt w:val="bullet"/>
+      <w:lvlText w:val=""/>
+      <w:lvlJc w:val="left"/>
+      <w:pPr>
+        <w:tabs>
+          <w:tab w:val="num" w:pos="5760"/>
+        </w:tabs>
+        <w:ind w:left="5760" w:hanging="360"/>
+      </w:pPr>
+      <w:rPr>
+        <w:rFonts w:ascii="Wingdings" w:hAnsi="Wingdings" w:hint="default"/>
+        <w:sz w:val="20"/>
+      </w:rPr>
+    </w:lvl>
+    <w:lvl w:ilvl="8" w:tentative="1">
+      <w:start w:val="1"/>
+      <w:numFmt w:val="bullet"/>
+      <w:lvlText w:val=""/>
+      <w:lvlJc w:val="left"/>
+      <w:pPr>
+        <w:tabs>
+          <w:tab w:val="num" w:pos="6480"/>
+        </w:tabs>
+        <w:ind w:left="6480" w:hanging="360"/>
+      </w:pPr>
+      <w:rPr>
+        <w:rFonts w:ascii="Wingdings" w:hAnsi="Wingdings" w:hint="default"/>
+        <w:sz w:val="20"/>
+      </w:rPr>
+    </w:lvl>
+  </w:abstractNum>
+  <w:abstractNum w:abstractNumId="9" w15:restartNumberingAfterBreak="0">
     <w:nsid w:val="7F0F32C6"/>
     <w:multiLevelType w:val="multilevel"/>
     <w:tmpl w:val="085C2118"/>
@@ -1826,22 +3428,34 @@
     </w:lvl>
   </w:abstractNum>
   <w:num w:numId="1" w16cid:durableId="2002003958">
+    <w:abstractNumId w:val="6"/>
+  </w:num>
+  <w:num w:numId="2" w16cid:durableId="639923306">
     <w:abstractNumId w:val="4"/>
   </w:num>
-  <w:num w:numId="2" w16cid:durableId="639923306">
+  <w:num w:numId="3" w16cid:durableId="371273694">
     <w:abstractNumId w:val="3"/>
-  </w:num>
-  <w:num w:numId="3" w16cid:durableId="371273694">
-    <w:abstractNumId w:val="2"/>
   </w:num>
   <w:num w:numId="4" w16cid:durableId="1545872702">
     <w:abstractNumId w:val="0"/>
   </w:num>
   <w:num w:numId="5" w16cid:durableId="238486708">
-    <w:abstractNumId w:val="5"/>
+    <w:abstractNumId w:val="9"/>
   </w:num>
   <w:num w:numId="6" w16cid:durableId="1527213921">
     <w:abstractNumId w:val="1"/>
+  </w:num>
+  <w:num w:numId="7" w16cid:durableId="1343389359">
+    <w:abstractNumId w:val="2"/>
+  </w:num>
+  <w:num w:numId="8" w16cid:durableId="28921018">
+    <w:abstractNumId w:val="8"/>
+  </w:num>
+  <w:num w:numId="9" w16cid:durableId="1554274342">
+    <w:abstractNumId w:val="7"/>
+  </w:num>
+  <w:num w:numId="10" w16cid:durableId="235095700">
+    <w:abstractNumId w:val="5"/>
   </w:num>
 </w:numbering>
 </file>
@@ -2246,6 +3860,7 @@
   <w:style w:type="paragraph" w:default="1" w:styleId="Normal">
     <w:name w:val="Normal"/>
     <w:qFormat/>
+    <w:rsid w:val="00D5042E"/>
   </w:style>
   <w:style w:type="paragraph" w:styleId="Ttulo1">
     <w:name w:val="heading 1"/>

</xml_diff>